<commit_message>
Complete lossless Word round-trip pipeline
Refs PsychQuant/macdoc#127
</commit_message>
<xml_diff>
--- a/Tests/OOXMLSwiftTests/Fixtures/mdocx/01-dual-extension-recognition/dual-extension-recognition.normalized.docx
+++ b/Tests/OOXMLSwiftTests/Fixtures/mdocx/01-dual-extension-recognition/dual-extension-recognition.normalized.docx
@@ -1,15 +1,13 @@
 
 <file path=word/document.xml><?xml version="1.0" encoding="utf-8"?>
-<w:document xmlns:w="http://schemas.openxmlformats.org/wordprocessingml/2006/main" xmlns:w14="http://schemas.microsoft.com/office/word/2010/wordml">
+<w:document xmlns:w="http://schemas.openxmlformats.org/wordprocessingml/2006/main" xmlns:w14="http://schemas.microsoft.com/office/word/2010/wordml" xmlns:r="http://schemas.openxmlformats.org/officeDocument/2006/relationships">
   <w:body>
     <w:p>
       <w:r>
         <w:t>Smoke fixture for dual-extension recognition</w:t>
       </w:r>
     </w:p>
-    <w:sectPr>
-      <w:pgSz w:w="12240" w:h="15840"/>
-    </w:sectPr>
+    <w:sectPr/>
   </w:body>
 </w:document>
 </file>
</xml_diff>